<commit_message>
Agrego nombre de alumnos
</commit_message>
<xml_diff>
--- a/Documentacion~ConsumoApiRest.docx
+++ b/Documentacion~ConsumoApiRest.docx
@@ -132,7 +132,7 @@
     <w:p>
       <w:r>
         <w:pict w14:anchorId="3A3DE3EA">
-          <v:rect id="_x0000_i1079" style="width:0;height:1.5pt" o:hralign="center" o:hrstd="t" o:hr="t" fillcolor="#a0a0a0" stroked="f"/>
+          <v:rect id="_x0000_i1025" style="width:0;height:1.5pt" o:hralign="center" o:hrstd="t" o:hr="t" fillcolor="#a0a0a0" stroked="f"/>
         </w:pict>
       </w:r>
     </w:p>
@@ -150,15 +150,7 @@
           <w:bCs/>
           <w:u w:val="single"/>
         </w:rPr>
-        <w:t>1. Introducción</w:t>
-      </w:r>
-      <w:r>
-        <w:rPr>
-          <w:b/>
-          <w:bCs/>
-          <w:u w:val="single"/>
-        </w:rPr>
-        <w:t>:</w:t>
+        <w:t>1. Introducción:</w:t>
       </w:r>
     </w:p>
     <w:p>
@@ -189,6 +181,9 @@
     </w:p>
     <w:p>
       <w:r>
+        <w:rPr>
+          <w:noProof/>
+        </w:rPr>
         <w:drawing>
           <wp:inline distT="0" distB="0" distL="0" distR="0" wp14:anchorId="0D3A050A" wp14:editId="60A813C7">
             <wp:extent cx="5400040" cy="2973705"/>
@@ -205,7 +200,7 @@
                     <pic:cNvPicPr/>
                   </pic:nvPicPr>
                   <pic:blipFill>
-                    <a:blip r:embed="rId5"/>
+                    <a:blip r:embed="rId7"/>
                     <a:stretch>
                       <a:fillRect/>
                     </a:stretch>
@@ -229,7 +224,7 @@
     <w:p>
       <w:r>
         <w:pict w14:anchorId="735D618B">
-          <v:rect id="_x0000_i1080" style="width:0;height:1.5pt" o:hralign="center" o:hrstd="t" o:hr="t" fillcolor="#a0a0a0" stroked="f"/>
+          <v:rect id="_x0000_i1026" style="width:0;height:1.5pt" o:hralign="center" o:hrstd="t" o:hr="t" fillcolor="#a0a0a0" stroked="f"/>
         </w:pict>
       </w:r>
     </w:p>
@@ -247,15 +242,7 @@
           <w:bCs/>
           <w:u w:val="single"/>
         </w:rPr>
-        <w:t>2. Tecnologías Utilizadas</w:t>
-      </w:r>
-      <w:r>
-        <w:rPr>
-          <w:b/>
-          <w:bCs/>
-          <w:u w:val="single"/>
-        </w:rPr>
-        <w:t>:</w:t>
+        <w:t>2. Tecnologías Utilizadas:</w:t>
       </w:r>
     </w:p>
     <w:p>
@@ -372,7 +359,7 @@
     <w:p>
       <w:r>
         <w:pict w14:anchorId="60741405">
-          <v:rect id="_x0000_i1081" style="width:0;height:1.5pt" o:hralign="center" o:hrstd="t" o:hr="t" fillcolor="#a0a0a0" stroked="f"/>
+          <v:rect id="_x0000_i1027" style="width:0;height:1.5pt" o:hralign="center" o:hrstd="t" o:hr="t" fillcolor="#a0a0a0" stroked="f"/>
         </w:pict>
       </w:r>
     </w:p>
@@ -468,7 +455,7 @@
       </w:r>
     </w:p>
     <w:p>
-      <w:hyperlink r:id="rId6" w:history="1">
+      <w:hyperlink r:id="rId8" w:history="1">
         <w:r>
           <w:rPr>
             <w:rStyle w:val="Hipervnculo"/>
@@ -518,7 +505,7 @@
     <w:p>
       <w:r>
         <w:pict w14:anchorId="6030EDD7">
-          <v:rect id="_x0000_i1082" style="width:0;height:1.5pt" o:hralign="center" o:hrstd="t" o:hr="t" fillcolor="#a0a0a0" stroked="f"/>
+          <v:rect id="_x0000_i1028" style="width:0;height:1.5pt" o:hralign="center" o:hrstd="t" o:hr="t" fillcolor="#a0a0a0" stroked="f"/>
         </w:pict>
       </w:r>
     </w:p>
@@ -569,7 +556,7 @@
       <w:r>
         <w:lastRenderedPageBreak/>
         <w:pict w14:anchorId="50212BC5">
-          <v:rect id="_x0000_i1083" style="width:0;height:1.5pt" o:hralign="center" o:hrstd="t" o:hr="t" fillcolor="#a0a0a0" stroked="f"/>
+          <v:rect id="_x0000_i1029" style="width:0;height:1.5pt" o:hralign="center" o:hrstd="t" o:hr="t" fillcolor="#a0a0a0" stroked="f"/>
         </w:pict>
       </w:r>
     </w:p>
@@ -690,7 +677,7 @@
     <w:p>
       <w:r>
         <w:pict w14:anchorId="2398F62A">
-          <v:rect id="_x0000_i1084" style="width:0;height:1.5pt" o:hralign="center" o:hrstd="t" o:hr="t" fillcolor="#a0a0a0" stroked="f"/>
+          <v:rect id="_x0000_i1030" style="width:0;height:1.5pt" o:hralign="center" o:hrstd="t" o:hr="t" fillcolor="#a0a0a0" stroked="f"/>
         </w:pict>
       </w:r>
     </w:p>
@@ -807,7 +794,7 @@
     <w:p>
       <w:r>
         <w:pict w14:anchorId="3E287BAE">
-          <v:rect id="_x0000_i1085" style="width:0;height:1.5pt" o:hralign="center" o:hrstd="t" o:hr="t" fillcolor="#a0a0a0" stroked="f"/>
+          <v:rect id="_x0000_i1031" style="width:0;height:1.5pt" o:hralign="center" o:hrstd="t" o:hr="t" fillcolor="#a0a0a0" stroked="f"/>
         </w:pict>
       </w:r>
     </w:p>
@@ -890,7 +877,7 @@
     <w:p>
       <w:r>
         <w:pict w14:anchorId="321D948F">
-          <v:rect id="_x0000_i1086" style="width:0;height:1.5pt" o:hralign="center" o:hrstd="t" o:hr="t" fillcolor="#a0a0a0" stroked="f"/>
+          <v:rect id="_x0000_i1032" style="width:0;height:1.5pt" o:hralign="center" o:hrstd="t" o:hr="t" fillcolor="#a0a0a0" stroked="f"/>
         </w:pict>
       </w:r>
     </w:p>
@@ -915,7 +902,7 @@
       </w:r>
     </w:p>
     <w:p>
-      <w:hyperlink r:id="rId7" w:history="1">
+      <w:hyperlink r:id="rId9" w:history="1">
         <w:r>
           <w:rPr>
             <w:rStyle w:val="Hipervnculo"/>
@@ -954,7 +941,7 @@
     <w:p>
       <w:r>
         <w:pict w14:anchorId="33D8FD54">
-          <v:rect id="_x0000_i1087" style="width:0;height:1.5pt" o:hralign="center" o:hrstd="t" o:hr="t" fillcolor="#a0a0a0" stroked="f"/>
+          <v:rect id="_x0000_i1033" style="width:0;height:1.5pt" o:hralign="center" o:hrstd="t" o:hr="t" fillcolor="#a0a0a0" stroked="f"/>
         </w:pict>
       </w:r>
     </w:p>
@@ -1006,6 +993,7 @@
     </w:p>
     <w:p/>
     <w:sectPr>
+      <w:headerReference w:type="default" r:id="rId10"/>
       <w:pgSz w:w="11906" w:h="16838"/>
       <w:pgMar w:top="1417" w:right="1701" w:bottom="1417" w:left="1701" w:header="708" w:footer="708" w:gutter="0"/>
       <w:cols w:space="708"/>
@@ -1013,6 +1001,96 @@
     </w:sectPr>
   </w:body>
 </w:document>
+</file>
+
+<file path=word/endnotes.xml><?xml version="1.0" encoding="utf-8"?>
+<w:endnotes xmlns:wpc="http://schemas.microsoft.com/office/word/2010/wordprocessingCanvas" xmlns:cx="http://schemas.microsoft.com/office/drawing/2014/chartex" xmlns:cx1="http://schemas.microsoft.com/office/drawing/2015/9/8/chartex" xmlns:cx2="http://schemas.microsoft.com/office/drawing/2015/10/21/chartex" xmlns:cx3="http://schemas.microsoft.com/office/drawing/2016/5/9/chartex" xmlns:cx4="http://schemas.microsoft.com/office/drawing/2016/5/10/chartex" xmlns:cx5="http://schemas.microsoft.com/office/drawing/2016/5/11/chartex" xmlns:cx6="http://schemas.microsoft.com/office/drawing/2016/5/12/chartex" xmlns:cx7="http://schemas.microsoft.com/office/drawing/2016/5/13/chartex" xmlns:cx8="http://schemas.microsoft.com/office/drawing/2016/5/14/chartex" xmlns:mc="http://schemas.openxmlformats.org/markup-compatibility/2006" xmlns:aink="http://schemas.microsoft.com/office/drawing/2016/ink" xmlns:am3d="http://schemas.microsoft.com/office/drawing/2017/model3d" xmlns:o="urn:schemas-microsoft-com:office:office" xmlns:oel="http://schemas.microsoft.com/office/2019/extlst" xmlns:r="http://schemas.openxmlformats.org/officeDocument/2006/relationships" xmlns:m="http://schemas.openxmlformats.org/officeDocument/2006/math" xmlns:v="urn:schemas-microsoft-com:vml" xmlns:wp14="http://schemas.microsoft.com/office/word/2010/wordprocessingDrawing" xmlns:wp="http://schemas.openxmlformats.org/drawingml/2006/wordprocessingDrawing" xmlns:w10="urn:schemas-microsoft-com:office:word" xmlns:w="http://schemas.openxmlformats.org/wordprocessingml/2006/main" xmlns:w14="http://schemas.microsoft.com/office/word/2010/wordml" xmlns:w15="http://schemas.microsoft.com/office/word/2012/wordml" xmlns:w16cex="http://schemas.microsoft.com/office/word/2018/wordml/cex" xmlns:w16cid="http://schemas.microsoft.com/office/word/2016/wordml/cid" xmlns:w16="http://schemas.microsoft.com/office/word/2018/wordml" xmlns:w16sdtdh="http://schemas.microsoft.com/office/word/2020/wordml/sdtdatahash" xmlns:w16se="http://schemas.microsoft.com/office/word/2015/wordml/symex" xmlns:wpg="http://schemas.microsoft.com/office/word/2010/wordprocessingGroup" xmlns:wpi="http://schemas.microsoft.com/office/word/2010/wordprocessingInk" xmlns:wne="http://schemas.microsoft.com/office/word/2006/wordml" xmlns:wps="http://schemas.microsoft.com/office/word/2010/wordprocessingShape" mc:Ignorable="w14 w15 w16se w16cid w16 w16cex w16sdtdh wp14">
+  <w:endnote w:type="separator" w:id="-1">
+    <w:p>
+      <w:pPr>
+        <w:spacing w:after="0" w:line="240" w:lineRule="auto"/>
+      </w:pPr>
+      <w:r>
+        <w:separator/>
+      </w:r>
+    </w:p>
+  </w:endnote>
+  <w:endnote w:type="continuationSeparator" w:id="0">
+    <w:p>
+      <w:pPr>
+        <w:spacing w:after="0" w:line="240" w:lineRule="auto"/>
+      </w:pPr>
+      <w:r>
+        <w:continuationSeparator/>
+      </w:r>
+    </w:p>
+  </w:endnote>
+</w:endnotes>
+</file>
+
+<file path=word/footnotes.xml><?xml version="1.0" encoding="utf-8"?>
+<w:footnotes xmlns:wpc="http://schemas.microsoft.com/office/word/2010/wordprocessingCanvas" xmlns:cx="http://schemas.microsoft.com/office/drawing/2014/chartex" xmlns:cx1="http://schemas.microsoft.com/office/drawing/2015/9/8/chartex" xmlns:cx2="http://schemas.microsoft.com/office/drawing/2015/10/21/chartex" xmlns:cx3="http://schemas.microsoft.com/office/drawing/2016/5/9/chartex" xmlns:cx4="http://schemas.microsoft.com/office/drawing/2016/5/10/chartex" xmlns:cx5="http://schemas.microsoft.com/office/drawing/2016/5/11/chartex" xmlns:cx6="http://schemas.microsoft.com/office/drawing/2016/5/12/chartex" xmlns:cx7="http://schemas.microsoft.com/office/drawing/2016/5/13/chartex" xmlns:cx8="http://schemas.microsoft.com/office/drawing/2016/5/14/chartex" xmlns:mc="http://schemas.openxmlformats.org/markup-compatibility/2006" xmlns:aink="http://schemas.microsoft.com/office/drawing/2016/ink" xmlns:am3d="http://schemas.microsoft.com/office/drawing/2017/model3d" xmlns:o="urn:schemas-microsoft-com:office:office" xmlns:oel="http://schemas.microsoft.com/office/2019/extlst" xmlns:r="http://schemas.openxmlformats.org/officeDocument/2006/relationships" xmlns:m="http://schemas.openxmlformats.org/officeDocument/2006/math" xmlns:v="urn:schemas-microsoft-com:vml" xmlns:wp14="http://schemas.microsoft.com/office/word/2010/wordprocessingDrawing" xmlns:wp="http://schemas.openxmlformats.org/drawingml/2006/wordprocessingDrawing" xmlns:w10="urn:schemas-microsoft-com:office:word" xmlns:w="http://schemas.openxmlformats.org/wordprocessingml/2006/main" xmlns:w14="http://schemas.microsoft.com/office/word/2010/wordml" xmlns:w15="http://schemas.microsoft.com/office/word/2012/wordml" xmlns:w16cex="http://schemas.microsoft.com/office/word/2018/wordml/cex" xmlns:w16cid="http://schemas.microsoft.com/office/word/2016/wordml/cid" xmlns:w16="http://schemas.microsoft.com/office/word/2018/wordml" xmlns:w16sdtdh="http://schemas.microsoft.com/office/word/2020/wordml/sdtdatahash" xmlns:w16se="http://schemas.microsoft.com/office/word/2015/wordml/symex" xmlns:wpg="http://schemas.microsoft.com/office/word/2010/wordprocessingGroup" xmlns:wpi="http://schemas.microsoft.com/office/word/2010/wordprocessingInk" xmlns:wne="http://schemas.microsoft.com/office/word/2006/wordml" xmlns:wps="http://schemas.microsoft.com/office/word/2010/wordprocessingShape" mc:Ignorable="w14 w15 w16se w16cid w16 w16cex w16sdtdh wp14">
+  <w:footnote w:type="separator" w:id="-1">
+    <w:p>
+      <w:pPr>
+        <w:spacing w:after="0" w:line="240" w:lineRule="auto"/>
+      </w:pPr>
+      <w:r>
+        <w:separator/>
+      </w:r>
+    </w:p>
+  </w:footnote>
+  <w:footnote w:type="continuationSeparator" w:id="0">
+    <w:p>
+      <w:pPr>
+        <w:spacing w:after="0" w:line="240" w:lineRule="auto"/>
+      </w:pPr>
+      <w:r>
+        <w:continuationSeparator/>
+      </w:r>
+    </w:p>
+  </w:footnote>
+</w:footnotes>
+</file>
+
+<file path=word/header1.xml><?xml version="1.0" encoding="utf-8"?>
+<w:hdr xmlns:wpc="http://schemas.microsoft.com/office/word/2010/wordprocessingCanvas" xmlns:cx="http://schemas.microsoft.com/office/drawing/2014/chartex" xmlns:cx1="http://schemas.microsoft.com/office/drawing/2015/9/8/chartex" xmlns:cx2="http://schemas.microsoft.com/office/drawing/2015/10/21/chartex" xmlns:cx3="http://schemas.microsoft.com/office/drawing/2016/5/9/chartex" xmlns:cx4="http://schemas.microsoft.com/office/drawing/2016/5/10/chartex" xmlns:cx5="http://schemas.microsoft.com/office/drawing/2016/5/11/chartex" xmlns:cx6="http://schemas.microsoft.com/office/drawing/2016/5/12/chartex" xmlns:cx7="http://schemas.microsoft.com/office/drawing/2016/5/13/chartex" xmlns:cx8="http://schemas.microsoft.com/office/drawing/2016/5/14/chartex" xmlns:mc="http://schemas.openxmlformats.org/markup-compatibility/2006" xmlns:aink="http://schemas.microsoft.com/office/drawing/2016/ink" xmlns:am3d="http://schemas.microsoft.com/office/drawing/2017/model3d" xmlns:o="urn:schemas-microsoft-com:office:office" xmlns:oel="http://schemas.microsoft.com/office/2019/extlst" xmlns:r="http://schemas.openxmlformats.org/officeDocument/2006/relationships" xmlns:m="http://schemas.openxmlformats.org/officeDocument/2006/math" xmlns:v="urn:schemas-microsoft-com:vml" xmlns:wp14="http://schemas.microsoft.com/office/word/2010/wordprocessingDrawing" xmlns:wp="http://schemas.openxmlformats.org/drawingml/2006/wordprocessingDrawing" xmlns:w10="urn:schemas-microsoft-com:office:word" xmlns:w="http://schemas.openxmlformats.org/wordprocessingml/2006/main" xmlns:w14="http://schemas.microsoft.com/office/word/2010/wordml" xmlns:w15="http://schemas.microsoft.com/office/word/2012/wordml" xmlns:w16cex="http://schemas.microsoft.com/office/word/2018/wordml/cex" xmlns:w16cid="http://schemas.microsoft.com/office/word/2016/wordml/cid" xmlns:w16="http://schemas.microsoft.com/office/word/2018/wordml" xmlns:w16sdtdh="http://schemas.microsoft.com/office/word/2020/wordml/sdtdatahash" xmlns:w16se="http://schemas.microsoft.com/office/word/2015/wordml/symex" xmlns:wpg="http://schemas.microsoft.com/office/word/2010/wordprocessingGroup" xmlns:wpi="http://schemas.microsoft.com/office/word/2010/wordprocessingInk" xmlns:wne="http://schemas.microsoft.com/office/word/2006/wordml" xmlns:wps="http://schemas.microsoft.com/office/word/2010/wordprocessingShape" mc:Ignorable="w14 w15 w16se w16cid w16 w16cex w16sdtdh wp14">
+  <w:p>
+    <w:pPr>
+      <w:pStyle w:val="Encabezado"/>
+    </w:pPr>
+    <w:proofErr w:type="spellStart"/>
+    <w:proofErr w:type="gramStart"/>
+    <w:r>
+      <w:rPr>
+        <w:b/>
+        <w:bCs/>
+      </w:rPr>
+      <w:t>Alumno:</w:t>
+    </w:r>
+    <w:r>
+      <w:t>Ezequiel</w:t>
+    </w:r>
+    <w:proofErr w:type="spellEnd"/>
+    <w:proofErr w:type="gramEnd"/>
+    <w:r>
+      <w:t xml:space="preserve"> </w:t>
+    </w:r>
+    <w:proofErr w:type="spellStart"/>
+    <w:r>
+      <w:t>Fernandez</w:t>
+    </w:r>
+    <w:proofErr w:type="spellEnd"/>
+    <w:r>
+      <w:t>, Agustin Zaforano</w:t>
+    </w:r>
+  </w:p>
+  <w:p>
+    <w:pPr>
+      <w:pStyle w:val="Encabezado"/>
+    </w:pPr>
+  </w:p>
+</w:hdr>
 </file>
 
 <file path=word/numbering.xml><?xml version="1.0" encoding="utf-8"?>
@@ -2383,6 +2461,7 @@
   <w:style w:type="character" w:default="1" w:styleId="Fuentedeprrafopredeter">
     <w:name w:val="Default Paragraph Font"/>
     <w:uiPriority w:val="1"/>
+    <w:semiHidden/>
     <w:unhideWhenUsed/>
   </w:style>
   <w:style w:type="table" w:default="1" w:styleId="Tablanormal">
@@ -2718,6 +2797,50 @@
       <w:color w:val="605E5C"/>
       <w:shd w:val="clear" w:color="auto" w:fill="E1DFDD"/>
     </w:rPr>
+  </w:style>
+  <w:style w:type="paragraph" w:styleId="Encabezado">
+    <w:name w:val="header"/>
+    <w:basedOn w:val="Normal"/>
+    <w:link w:val="EncabezadoCar"/>
+    <w:uiPriority w:val="99"/>
+    <w:unhideWhenUsed/>
+    <w:rsid w:val="007E7CCB"/>
+    <w:pPr>
+      <w:tabs>
+        <w:tab w:val="center" w:pos="4252"/>
+        <w:tab w:val="right" w:pos="8504"/>
+      </w:tabs>
+      <w:spacing w:after="0" w:line="240" w:lineRule="auto"/>
+    </w:pPr>
+  </w:style>
+  <w:style w:type="character" w:customStyle="1" w:styleId="EncabezadoCar">
+    <w:name w:val="Encabezado Car"/>
+    <w:basedOn w:val="Fuentedeprrafopredeter"/>
+    <w:link w:val="Encabezado"/>
+    <w:uiPriority w:val="99"/>
+    <w:rsid w:val="007E7CCB"/>
+  </w:style>
+  <w:style w:type="paragraph" w:styleId="Piedepgina">
+    <w:name w:val="footer"/>
+    <w:basedOn w:val="Normal"/>
+    <w:link w:val="PiedepginaCar"/>
+    <w:uiPriority w:val="99"/>
+    <w:unhideWhenUsed/>
+    <w:rsid w:val="007E7CCB"/>
+    <w:pPr>
+      <w:tabs>
+        <w:tab w:val="center" w:pos="4252"/>
+        <w:tab w:val="right" w:pos="8504"/>
+      </w:tabs>
+      <w:spacing w:after="0" w:line="240" w:lineRule="auto"/>
+    </w:pPr>
+  </w:style>
+  <w:style w:type="character" w:customStyle="1" w:styleId="PiedepginaCar">
+    <w:name w:val="Pie de página Car"/>
+    <w:basedOn w:val="Fuentedeprrafopredeter"/>
+    <w:link w:val="Piedepgina"/>
+    <w:uiPriority w:val="99"/>
+    <w:rsid w:val="007E7CCB"/>
   </w:style>
 </w:styles>
 </file>

</xml_diff>

<commit_message>
Se agrego link de la pagina web con el host
</commit_message>
<xml_diff>
--- a/Documentacion~ConsumoApiRest.docx
+++ b/Documentacion~ConsumoApiRest.docx
@@ -534,17 +534,12 @@
         <w:t xml:space="preserve">A medida que el usuario escribe en el buscador, se ejecuta una función que filtra los personajes obtenidos desde la API utilizando el método </w:t>
       </w:r>
       <w:proofErr w:type="spellStart"/>
-      <w:proofErr w:type="gramStart"/>
       <w:r>
         <w:t>filter</w:t>
       </w:r>
       <w:proofErr w:type="spellEnd"/>
       <w:r>
-        <w:t>(</w:t>
-      </w:r>
-      <w:proofErr w:type="gramEnd"/>
-      <w:r>
-        <w:t>) de JavaScript.</w:t>
+        <w:t>() de JavaScript.</w:t>
       </w:r>
     </w:p>
     <w:p>
@@ -755,15 +750,7 @@
       </w:r>
       <w:proofErr w:type="spellEnd"/>
       <w:r>
-        <w:t xml:space="preserve"> se encontraba </w:t>
-      </w:r>
-      <w:proofErr w:type="gramStart"/>
-      <w:r>
-        <w:t>instalado</w:t>
-      </w:r>
-      <w:proofErr w:type="gramEnd"/>
-      <w:r>
-        <w:t xml:space="preserve"> pero no configurado correctamente.</w:t>
+        <w:t xml:space="preserve"> se encontraba instalado pero no configurado correctamente.</w:t>
       </w:r>
     </w:p>
     <w:p>
@@ -926,18 +913,16 @@
       </w:r>
     </w:p>
     <w:p>
-      <w:r>
-        <w:t xml:space="preserve">[Agregar URL </w:t>
-      </w:r>
-      <w:proofErr w:type="spellStart"/>
-      <w:r>
-        <w:t>Firebase</w:t>
-      </w:r>
-      <w:proofErr w:type="spellEnd"/>
-      <w:r>
-        <w:t>]</w:t>
-      </w:r>
-    </w:p>
+      <w:hyperlink r:id="rId10" w:history="1">
+        <w:r>
+          <w:rPr>
+            <w:rStyle w:val="Hipervnculo"/>
+          </w:rPr>
+          <w:t>https://angularproject-2ec17.web.app/</w:t>
+        </w:r>
+      </w:hyperlink>
+    </w:p>
+    <w:p/>
     <w:p>
       <w:r>
         <w:pict w14:anchorId="33D8FD54">
@@ -993,7 +978,7 @@
     </w:p>
     <w:p/>
     <w:sectPr>
-      <w:headerReference w:type="default" r:id="rId10"/>
+      <w:headerReference w:type="default" r:id="rId11"/>
       <w:pgSz w:w="11906" w:h="16838"/>
       <w:pgMar w:top="1417" w:right="1701" w:bottom="1417" w:left="1701" w:header="708" w:footer="708" w:gutter="0"/>
       <w:cols w:space="708"/>
@@ -1060,7 +1045,6 @@
       <w:pStyle w:val="Encabezado"/>
     </w:pPr>
     <w:proofErr w:type="spellStart"/>
-    <w:proofErr w:type="gramStart"/>
     <w:r>
       <w:rPr>
         <w:b/>
@@ -1072,7 +1056,6 @@
       <w:t>Ezequiel</w:t>
     </w:r>
     <w:proofErr w:type="spellEnd"/>
-    <w:proofErr w:type="gramEnd"/>
     <w:r>
       <w:t xml:space="preserve"> </w:t>
     </w:r>

</xml_diff>